<commit_message>
change in Invoice Template
</commit_message>
<xml_diff>
--- a/InvoiceTemplate.docx
+++ b/InvoiceTemplate.docx
@@ -1,6 +1,6 @@
 
 <file path=word/document.xml><?xml version="1.0" encoding="utf-8"?>
-<w:document xmlns:a="http://schemas.openxmlformats.org/drawingml/2006/main" xmlns:pic="http://schemas.openxmlformats.org/drawingml/2006/picture" xmlns:wpc="http://schemas.microsoft.com/office/word/2010/wordprocessingCanvas" xmlns:cx="http://schemas.microsoft.com/office/drawing/2014/chartex" xmlns:cx1="http://schemas.microsoft.com/office/drawing/2015/9/8/chartex" xmlns:cx2="http://schemas.microsoft.com/office/drawing/2015/10/21/chartex" xmlns:cx3="http://schemas.microsoft.com/office/drawing/2016/5/9/chartex" xmlns:cx4="http://schemas.microsoft.com/office/drawing/2016/5/10/chartex" xmlns:cx5="http://schemas.microsoft.com/office/drawing/2016/5/11/chartex" xmlns:cx6="http://schemas.microsoft.com/office/drawing/2016/5/12/chartex" xmlns:cx7="http://schemas.microsoft.com/office/drawing/2016/5/13/chartex" xmlns:cx8="http://schemas.microsoft.com/office/drawing/2016/5/14/chartex" xmlns:mc="http://schemas.openxmlformats.org/markup-compatibility/2006" xmlns:aink="http://schemas.microsoft.com/office/drawing/2016/ink" xmlns:am3d="http://schemas.microsoft.com/office/drawing/2017/model3d" xmlns:o="urn:schemas-microsoft-com:office:office" xmlns:oel="http://schemas.microsoft.com/office/2019/extlst" xmlns:r="http://schemas.openxmlformats.org/officeDocument/2006/relationships" xmlns:m="http://schemas.openxmlformats.org/officeDocument/2006/math" xmlns:v="urn:schemas-microsoft-com:vml" xmlns:wp14="http://schemas.microsoft.com/office/word/2010/wordprocessingDrawing" xmlns:wp="http://schemas.openxmlformats.org/drawingml/2006/wordprocessingDrawing" xmlns:w10="urn:schemas-microsoft-com:office:word" xmlns:w="http://schemas.openxmlformats.org/wordprocessingml/2006/main" xmlns:w14="http://schemas.microsoft.com/office/word/2010/wordml" xmlns:w15="http://schemas.microsoft.com/office/word/2012/wordml" xmlns:w16cex="http://schemas.microsoft.com/office/word/2018/wordml/cex" xmlns:w16cid="http://schemas.microsoft.com/office/word/2016/wordml/cid" xmlns:w16="http://schemas.microsoft.com/office/word/2018/wordml" xmlns:w16du="http://schemas.microsoft.com/office/word/2023/wordml/word16du" xmlns:w16sdtdh="http://schemas.microsoft.com/office/word/2020/wordml/sdtdatahash" xmlns:w16se="http://schemas.microsoft.com/office/word/2015/wordml/symex" xmlns:wpg="http://schemas.microsoft.com/office/word/2010/wordprocessingGroup" xmlns:wpi="http://schemas.microsoft.com/office/word/2010/wordprocessingInk" xmlns:wne="http://schemas.microsoft.com/office/word/2006/wordml" xmlns:wps="http://schemas.microsoft.com/office/word/2010/wordprocessingShape" mc:Ignorable="w14 w15 w16se w16cid w16 w16cex w16sdtdh w16du wp14">
+<w:document xmlns:wpc="http://schemas.microsoft.com/office/word/2010/wordprocessingCanvas" xmlns:cx="http://schemas.microsoft.com/office/drawing/2014/chartex" xmlns:cx1="http://schemas.microsoft.com/office/drawing/2015/9/8/chartex" xmlns:cx2="http://schemas.microsoft.com/office/drawing/2015/10/21/chartex" xmlns:cx3="http://schemas.microsoft.com/office/drawing/2016/5/9/chartex" xmlns:cx4="http://schemas.microsoft.com/office/drawing/2016/5/10/chartex" xmlns:cx5="http://schemas.microsoft.com/office/drawing/2016/5/11/chartex" xmlns:cx6="http://schemas.microsoft.com/office/drawing/2016/5/12/chartex" xmlns:cx7="http://schemas.microsoft.com/office/drawing/2016/5/13/chartex" xmlns:cx8="http://schemas.microsoft.com/office/drawing/2016/5/14/chartex" xmlns:mc="http://schemas.openxmlformats.org/markup-compatibility/2006" xmlns:aink="http://schemas.microsoft.com/office/drawing/2016/ink" xmlns:am3d="http://schemas.microsoft.com/office/drawing/2017/model3d" xmlns:o="urn:schemas-microsoft-com:office:office" xmlns:oel="http://schemas.microsoft.com/office/2019/extlst" xmlns:r="http://schemas.openxmlformats.org/officeDocument/2006/relationships" xmlns:m="http://schemas.openxmlformats.org/officeDocument/2006/math" xmlns:v="urn:schemas-microsoft-com:vml" xmlns:wp14="http://schemas.microsoft.com/office/word/2010/wordprocessingDrawing" xmlns:wp="http://schemas.openxmlformats.org/drawingml/2006/wordprocessingDrawing" xmlns:w10="urn:schemas-microsoft-com:office:word" xmlns:w="http://schemas.openxmlformats.org/wordprocessingml/2006/main" xmlns:w14="http://schemas.microsoft.com/office/word/2010/wordml" xmlns:w15="http://schemas.microsoft.com/office/word/2012/wordml" xmlns:w16cex="http://schemas.microsoft.com/office/word/2018/wordml/cex" xmlns:w16cid="http://schemas.microsoft.com/office/word/2016/wordml/cid" xmlns:w16="http://schemas.microsoft.com/office/word/2018/wordml" xmlns:w16du="http://schemas.microsoft.com/office/word/2023/wordml/word16du" xmlns:w16sdtdh="http://schemas.microsoft.com/office/word/2020/wordml/sdtdatahash" xmlns:w16se="http://schemas.microsoft.com/office/word/2015/wordml/symex" xmlns:wpg="http://schemas.microsoft.com/office/word/2010/wordprocessingGroup" xmlns:wpi="http://schemas.microsoft.com/office/word/2010/wordprocessingInk" xmlns:wne="http://schemas.microsoft.com/office/word/2006/wordml" xmlns:wps="http://schemas.microsoft.com/office/word/2010/wordprocessingShape" mc:Ignorable="w14 w15 w16se w16cid w16 w16cex w16sdtdh w16du wp14">
   <w:body>
     <w:tbl>
       <w:tblPr>
@@ -20,10 +20,10 @@
           <w:tcPr>
             <w:tcW w:w="11341" w:type="dxa"/>
             <w:tcBorders>
-              <w:top w:val="single" w:color="auto" w:sz="12" w:space="0"/>
-              <w:left w:val="single" w:color="auto" w:sz="12" w:space="0"/>
-              <w:bottom w:val="single" w:color="auto" w:sz="12" w:space="0"/>
-              <w:right w:val="single" w:color="auto" w:sz="12" w:space="0"/>
+              <w:top w:val="single" w:sz="12" w:space="0" w:color="auto"/>
+              <w:left w:val="single" w:sz="12" w:space="0" w:color="auto"/>
+              <w:bottom w:val="single" w:sz="12" w:space="0" w:color="auto"/>
+              <w:right w:val="single" w:sz="12" w:space="0" w:color="auto"/>
             </w:tcBorders>
           </w:tcPr>
           <w:tbl>
@@ -75,6 +75,7 @@
                       <w:text/>
                     </w:sdtPr>
                     <w:sdtContent>
+                      <w:proofErr w:type="spellStart"/>
                       <w:r>
                         <w:rPr>
                           <w:b/>
@@ -84,6 +85,7 @@
                         </w:rPr>
                         <w:t>CompanyName</w:t>
                       </w:r>
+                      <w:proofErr w:type="spellEnd"/>
                     </w:sdtContent>
                   </w:sdt>
                 </w:p>
@@ -143,9 +145,11 @@
                       </w:tcBorders>
                     </w:tcPr>
                     <w:p>
+                      <w:proofErr w:type="spellStart"/>
                       <w:r>
                         <w:t>CompanyAddress</w:t>
                       </w:r>
+                      <w:proofErr w:type="spellEnd"/>
                     </w:p>
                   </w:tc>
                 </w:sdtContent>
@@ -168,7 +172,7 @@
                         <w:top w:val="nil"/>
                         <w:left w:val="nil"/>
                         <w:bottom w:val="nil"/>
-                        <w:right w:val="single" w:color="auto" w:sz="4" w:space="0"/>
+                        <w:right w:val="single" w:sz="4" w:space="0" w:color="auto"/>
                       </w:tcBorders>
                     </w:tcPr>
                     <w:p>
@@ -250,6 +254,7 @@
                       <w:text/>
                     </w:sdtPr>
                     <w:sdtContent>
+                      <w:proofErr w:type="spellStart"/>
                       <w:r>
                         <w:t>CompanyCity</w:t>
                       </w:r>
@@ -293,6 +298,7 @@
                       <w:r>
                         <w:t>CompanyCountry</w:t>
                       </w:r>
+                      <w:proofErr w:type="spellEnd"/>
                     </w:sdtContent>
                   </w:sdt>
                 </w:p>
@@ -306,7 +312,7 @@
                     <w:top w:val="nil"/>
                     <w:left w:val="nil"/>
                     <w:bottom w:val="nil"/>
-                    <w:right w:val="single" w:color="auto" w:sz="4" w:space="0"/>
+                    <w:right w:val="single" w:sz="4" w:space="0" w:color="auto"/>
                   </w:tcBorders>
                 </w:tcPr>
                 <w:p/>
@@ -339,9 +345,11 @@
                       <w:text/>
                     </w:sdtPr>
                     <w:sdtContent>
+                      <w:proofErr w:type="spellStart"/>
                       <w:r>
                         <w:t>CompanyPhone</w:t>
                       </w:r>
+                      <w:proofErr w:type="spellEnd"/>
                     </w:sdtContent>
                   </w:sdt>
                 </w:p>
@@ -355,7 +363,7 @@
                     <w:top w:val="nil"/>
                     <w:left w:val="nil"/>
                     <w:bottom w:val="nil"/>
-                    <w:right w:val="single" w:color="auto" w:sz="4" w:space="0"/>
+                    <w:right w:val="single" w:sz="4" w:space="0" w:color="auto"/>
                   </w:tcBorders>
                 </w:tcPr>
                 <w:p/>
@@ -388,9 +396,11 @@
                       <w:text/>
                     </w:sdtPr>
                     <w:sdtContent>
+                      <w:proofErr w:type="spellStart"/>
                       <w:r>
                         <w:t>CompanyEmail</w:t>
                       </w:r>
+                      <w:proofErr w:type="spellEnd"/>
                     </w:sdtContent>
                   </w:sdt>
                 </w:p>
@@ -404,7 +414,7 @@
                     <w:top w:val="nil"/>
                     <w:left w:val="nil"/>
                     <w:bottom w:val="nil"/>
-                    <w:right w:val="single" w:color="auto" w:sz="4" w:space="0"/>
+                    <w:right w:val="single" w:sz="4" w:space="0" w:color="auto"/>
                   </w:tcBorders>
                 </w:tcPr>
                 <w:p/>
@@ -436,7 +446,7 @@
                     <w:top w:val="nil"/>
                     <w:left w:val="nil"/>
                     <w:bottom w:val="nil"/>
-                    <w:right w:val="single" w:color="auto" w:sz="4" w:space="0"/>
+                    <w:right w:val="single" w:sz="4" w:space="0" w:color="auto"/>
                   </w:tcBorders>
                 </w:tcPr>
                 <w:p/>
@@ -508,7 +518,7 @@
                   <w:gridSpan w:val="3"/>
                   <w:tcBorders>
                     <w:top w:val="nil"/>
-                    <w:bottom w:val="single" w:color="auto" w:sz="4" w:space="0"/>
+                    <w:bottom w:val="single" w:sz="4" w:space="0" w:color="auto"/>
                   </w:tcBorders>
                 </w:tcPr>
                 <w:p>
@@ -527,9 +537,11 @@
                       <w:text/>
                     </w:sdtPr>
                     <w:sdtContent>
+                      <w:proofErr w:type="spellStart"/>
                       <w:r>
                         <w:t>Posting_Date</w:t>
                       </w:r>
+                      <w:proofErr w:type="spellEnd"/>
                     </w:sdtContent>
                   </w:sdt>
                 </w:p>
@@ -540,7 +552,7 @@
                   <w:gridSpan w:val="4"/>
                   <w:tcBorders>
                     <w:top w:val="nil"/>
-                    <w:bottom w:val="single" w:color="auto" w:sz="4" w:space="0"/>
+                    <w:bottom w:val="single" w:sz="4" w:space="0" w:color="auto"/>
                   </w:tcBorders>
                 </w:tcPr>
                 <w:p>
@@ -616,6 +628,7 @@
                       </w:tcBorders>
                     </w:tcPr>
                     <w:p>
+                      <w:proofErr w:type="spellStart"/>
                       <w:r>
                         <w:rPr>
                           <w:b/>
@@ -623,6 +636,7 @@
                         </w:rPr>
                         <w:t>Sell_to_Customer_Name</w:t>
                       </w:r>
+                      <w:proofErr w:type="spellEnd"/>
                     </w:p>
                   </w:tc>
                 </w:sdtContent>
@@ -651,9 +665,11 @@
                       <w:text/>
                     </w:sdtPr>
                     <w:sdtContent>
+                      <w:proofErr w:type="spellStart"/>
                       <w:r>
                         <w:t>Contract_ID</w:t>
                       </w:r>
+                      <w:proofErr w:type="spellEnd"/>
                     </w:sdtContent>
                   </w:sdt>
                 </w:p>
@@ -685,9 +701,11 @@
                       </w:tcBorders>
                     </w:tcPr>
                     <w:p>
+                      <w:proofErr w:type="spellStart"/>
                       <w:r>
                         <w:t>Bill_to_Address</w:t>
                       </w:r>
+                      <w:proofErr w:type="spellEnd"/>
                     </w:p>
                   </w:tc>
                 </w:sdtContent>
@@ -717,9 +735,11 @@
                       <w:text/>
                     </w:sdtPr>
                     <w:sdtContent>
+                      <w:proofErr w:type="spellStart"/>
                       <w:r>
                         <w:t>Property_Name</w:t>
                       </w:r>
+                      <w:proofErr w:type="spellEnd"/>
                     </w:sdtContent>
                   </w:sdt>
                 </w:p>
@@ -754,8 +774,13 @@
                       <w:text/>
                     </w:sdtPr>
                     <w:sdtContent>
+                      <w:proofErr w:type="spellStart"/>
                       <w:r>
-                        <w:t>Sell_to_Phone_No_</w:t>
+                        <w:t>Sell_to_Phone_No</w:t>
+                      </w:r>
+                      <w:proofErr w:type="spellEnd"/>
+                      <w:r>
+                        <w:t>_</w:t>
                       </w:r>
                     </w:sdtContent>
                   </w:sdt>
@@ -786,9 +811,11 @@
                       <w:text/>
                     </w:sdtPr>
                     <w:sdtContent>
+                      <w:proofErr w:type="spellStart"/>
                       <w:r>
                         <w:t>Unit_Name</w:t>
                       </w:r>
+                      <w:proofErr w:type="spellEnd"/>
                     </w:sdtContent>
                   </w:sdt>
                 </w:p>
@@ -823,9 +850,11 @@
                       <w:text/>
                     </w:sdtPr>
                     <w:sdtContent>
+                      <w:proofErr w:type="spellStart"/>
                       <w:r>
                         <w:t>Sell_to_E_Mail</w:t>
                       </w:r>
+                      <w:proofErr w:type="spellEnd"/>
                     </w:sdtContent>
                   </w:sdt>
                 </w:p>
@@ -874,8 +903,13 @@
                       <w:text/>
                     </w:sdtPr>
                     <w:sdtContent>
+                      <w:proofErr w:type="spellStart"/>
                       <w:r>
-                        <w:t>VAT_Registration_No_</w:t>
+                        <w:t>VAT_Registration_No</w:t>
+                      </w:r>
+                      <w:proofErr w:type="spellEnd"/>
+                      <w:r>
+                        <w:t>_</w:t>
                       </w:r>
                     </w:sdtContent>
                   </w:sdt>
@@ -905,9 +939,11 @@
                       <w:text/>
                     </w:sdtPr>
                     <w:sdtContent>
+                      <w:proofErr w:type="spellStart"/>
                       <w:r>
                         <w:t>Contract_Tenor</w:t>
                       </w:r>
+                      <w:proofErr w:type="spellEnd"/>
                     </w:sdtContent>
                   </w:sdt>
                 </w:p>
@@ -1062,7 +1098,7 @@
                 <w:alias w:val="#Nav: /SalesHeader/Sales_Line"/>
                 <w:tag w:val="#Nav: InvoiceTemplate/50104"/>
                 <w:id w:val="1820616093"/>
-                <w15:dataBinding w:prefixMappings="xmlns:ns0='urn:microsoft-dynamics-nav/reports/InvoiceTemplate/50104/'" w:xpath="/ns0:NavWordReportXmlPart[1]/ns0:SalesHeader[1]/ns0:Sales_Line" w:storeItemID="{4C18056B-02F0-444B-B2FC-0BE4239C06C0}"/>
+                <w15:dataBinding w:prefixMappings="xmlns:ns0='urn:microsoft-dynamics-nav/reports/InvoiceTemplate/50104/' " w:xpath="/ns0:NavWordReportXmlPart[1]/ns0:SalesHeader[1]/ns0:Sales_Line" w:storeItemID="{4C18056B-02F0-444B-B2FC-0BE4239C06C0}"/>
                 <w15:repeatingSection/>
               </w:sdtPr>
               <w:sdtContent>
@@ -1160,14 +1196,14 @@
                       </w:sdt>
                       <w:sdt>
                         <w:sdtPr>
+                          <w:alias w:val="#Nav: /SalesHeader/Sales_Line/VAT_Base_Amount"/>
+                          <w:tag w:val="#Nav: InvoiceTemplate/50104"/>
                           <w:id w:val="-1459408842"/>
                           <w:placeholder>
                             <w:docPart w:val="DefaultPlaceholder_-1854013440"/>
                           </w:placeholder>
                           <w:dataBinding w:prefixMappings="xmlns:ns0='urn:microsoft-dynamics-nav/reports/InvoiceTemplate/50104/'" w:xpath="/ns0:NavWordReportXmlPart[1]/ns0:SalesHeader[1]/ns0:Sales_Line[1]/ns0:VAT_Base_Amount[1]" w:storeItemID="{4C18056B-02F0-444B-B2FC-0BE4239C06C0}"/>
                           <w:text/>
-                          <w:alias w:val="#Nav: /SalesHeader/Sales_Line/VAT_Base_Amount"/>
-                          <w:tag w:val="#Nav: InvoiceTemplate/50104"/>
                         </w:sdtPr>
                         <w:sdtContent>
                           <w:tc>
@@ -1199,9 +1235,11 @@
                               <w:tcW w:w="1961" w:type="dxa"/>
                             </w:tcPr>
                             <w:p>
+                              <w:proofErr w:type="spellStart"/>
                               <w:r>
                                 <w:t>Amount_Including_VAT</w:t>
                               </w:r>
+                              <w:proofErr w:type="spellEnd"/>
                             </w:p>
                           </w:tc>
                         </w:sdtContent>
@@ -1301,9 +1339,11 @@
                       <w:pPr>
                         <w:jc w:val="right"/>
                       </w:pPr>
+                      <w:proofErr w:type="spellStart"/>
                       <w:r>
                         <w:t>TotalAmountInclVAT</w:t>
                       </w:r>
+                      <w:proofErr w:type="spellEnd"/>
                     </w:p>
                   </w:tc>
                 </w:sdtContent>
@@ -1318,7 +1358,7 @@
                   <w:tcW w:w="10795" w:type="dxa"/>
                   <w:gridSpan w:val="7"/>
                   <w:tcBorders>
-                    <w:bottom w:val="single" w:color="auto" w:sz="4" w:space="0"/>
+                    <w:bottom w:val="single" w:sz="4" w:space="0" w:color="auto"/>
                   </w:tcBorders>
                 </w:tcPr>
                 <w:p>
@@ -1328,73 +1368,6 @@
                       <w:bCs/>
                     </w:rPr>
                   </w:pPr>
-                  <w:r>
-                    <w:rPr>
-                      <w:b/>
-                      <w:bCs/>
-                    </w:rPr>
-                    <w:t>Total (In words)</w:t>
-                  </w:r>
-                  <w:r>
-                    <w:rPr>
-                      <w:b/>
-                      <w:bCs/>
-                    </w:rPr>
-                    <w:t xml:space="preserve"> </w:t>
-                  </w:r>
-                  <w:r>
-                    <w:rPr>
-                      <w:b/>
-                      <w:bCs/>
-                    </w:rPr>
-                    <w:t xml:space="preserve"> </w:t>
-                  </w:r>
-                  <w:r>
-                    <w:rPr>
-                      <w:b/>
-                      <w:bCs/>
-                    </w:rPr>
-                    <w:t xml:space="preserve">: </w:t>
-                  </w:r>
-                  <w:r>
-                    <w:rPr>
-                      <w:b/>
-                      <w:bCs/>
-                    </w:rPr>
-                    <w:t xml:space="preserve"> </w:t>
-                  </w:r>
-                  <w:sdt>
-                    <w:sdtPr>
-                      <w:rPr>
-                        <w:b/>
-                        <w:bCs/>
-                      </w:rPr>
-                      <w:alias w:val="#Nav: /SalesHeader/Totals/AmountInWords"/>
-                      <w:tag w:val="#Nav: InvoiceTemplate/50104"/>
-                      <w:id w:val="-1328666666"/>
-                      <w:placeholder>
-                        <w:docPart w:val="DefaultPlaceholder_-1854013440"/>
-                      </w:placeholder>
-                      <w:dataBinding w:prefixMappings="xmlns:ns0='urn:microsoft-dynamics-nav/reports/InvoiceTemplate/50104/'" w:xpath="/ns0:NavWordReportXmlPart[1]/ns0:SalesHeader[1]/ns0:Totals[1]/ns0:AmountInWords[1]" w:storeItemID="{4C18056B-02F0-444B-B2FC-0BE4239C06C0}"/>
-                      <w:text/>
-                    </w:sdtPr>
-                    <w:sdtContent>
-                      <w:r>
-                        <w:rPr>
-                          <w:b/>
-                          <w:bCs/>
-                        </w:rPr>
-                        <w:t>AmountInWords</w:t>
-                      </w:r>
-                    </w:sdtContent>
-                  </w:sdt>
-                  <w:r>
-                    <w:rPr>
-                      <w:b/>
-                      <w:bCs/>
-                    </w:rPr>
-                    <w:br/>
-                  </w:r>
                 </w:p>
               </w:tc>
             </w:tr>
@@ -1533,6 +1506,7 @@
                       <w:text/>
                     </w:sdtPr>
                     <w:sdtContent>
+                      <w:proofErr w:type="spellStart"/>
                       <w:r>
                         <w:rPr>
                           <w:rFonts w:ascii="Arial" w:hAnsi="Arial" w:cs="Arial"/>
@@ -1541,6 +1515,7 @@
                         </w:rPr>
                         <w:t>CompanyName</w:t>
                       </w:r>
+                      <w:proofErr w:type="spellEnd"/>
                     </w:sdtContent>
                   </w:sdt>
                 </w:p>
@@ -1586,6 +1561,7 @@
                       <w:text/>
                     </w:sdtPr>
                     <w:sdtContent>
+                      <w:proofErr w:type="spellStart"/>
                       <w:r>
                         <w:rPr>
                           <w:rFonts w:ascii="Arial" w:hAnsi="Arial" w:cs="Arial"/>
@@ -1594,6 +1570,7 @@
                         </w:rPr>
                         <w:t>BankAccountName</w:t>
                       </w:r>
+                      <w:proofErr w:type="spellEnd"/>
                     </w:sdtContent>
                   </w:sdt>
                 </w:p>
@@ -1680,6 +1657,7 @@
                       <w:text/>
                     </w:sdtPr>
                     <w:sdtContent>
+                      <w:proofErr w:type="spellStart"/>
                       <w:r>
                         <w:rPr>
                           <w:rFonts w:ascii="Arial" w:hAnsi="Arial" w:cs="Arial"/>
@@ -1688,6 +1666,7 @@
                         </w:rPr>
                         <w:t>BankAccountNo</w:t>
                       </w:r>
+                      <w:proofErr w:type="spellEnd"/>
                     </w:sdtContent>
                   </w:sdt>
                 </w:p>
@@ -1768,6 +1747,7 @@
                       <w:text/>
                     </w:sdtPr>
                     <w:sdtContent>
+                      <w:proofErr w:type="spellStart"/>
                       <w:r>
                         <w:rPr>
                           <w:rFonts w:ascii="Arial" w:hAnsi="Arial" w:cs="Arial"/>
@@ -1776,6 +1756,7 @@
                         </w:rPr>
                         <w:t>BankIBAN</w:t>
                       </w:r>
+                      <w:proofErr w:type="spellEnd"/>
                     </w:sdtContent>
                   </w:sdt>
                 </w:p>
@@ -1856,6 +1837,7 @@
                       <w:text/>
                     </w:sdtPr>
                     <w:sdtContent>
+                      <w:proofErr w:type="spellStart"/>
                       <w:r>
                         <w:rPr>
                           <w:rFonts w:ascii="Arial" w:hAnsi="Arial" w:cs="Arial"/>
@@ -1864,6 +1846,7 @@
                         </w:rPr>
                         <w:t>BankSwiftCode</w:t>
                       </w:r>
+                      <w:proofErr w:type="spellEnd"/>
                     </w:sdtContent>
                   </w:sdt>
                 </w:p>
@@ -1942,6 +1925,7 @@
                       <w:text/>
                     </w:sdtPr>
                     <w:sdtContent>
+                      <w:proofErr w:type="spellStart"/>
                       <w:r>
                         <w:rPr>
                           <w:rFonts w:ascii="Arial" w:hAnsi="Arial" w:cs="Arial"/>
@@ -1950,6 +1934,7 @@
                         </w:rPr>
                         <w:t>BankBranch</w:t>
                       </w:r>
+                      <w:proofErr w:type="spellEnd"/>
                     </w:sdtContent>
                   </w:sdt>
                 </w:p>
@@ -2030,7 +2015,7 @@
     <w:sectPr>
       <w:pgSz w:w="11906" w:h="16838"/>
       <w:pgMar w:top="1701" w:right="1134" w:bottom="1701" w:left="1134" w:header="708" w:footer="708" w:gutter="0"/>
-      <w:cols w:space="708" w:num="2"/>
+      <w:cols w:num="2" w:space="708"/>
       <w:docGrid w:linePitch="360"/>
     </w:sectPr>
   </w:body>
@@ -2860,6 +2845,7 @@
   </w:compat>
   <w:rsids>
     <w:rsidRoot w:val="001F1BB3"/>
+    <w:rsid w:val="000257B6"/>
     <w:rsid w:val="00070E5A"/>
     <w:rsid w:val="000860A6"/>
     <w:rsid w:val="000A6C17"/>
@@ -2891,6 +2877,7 @@
     <w:rsid w:val="00460583"/>
     <w:rsid w:val="004B1BC1"/>
     <w:rsid w:val="004C3B95"/>
+    <w:rsid w:val="00502FA4"/>
     <w:rsid w:val="00521BEF"/>
     <w:rsid w:val="005231FC"/>
     <w:rsid w:val="00576AAC"/>
@@ -3744,115 +3731,115 @@
 </a:theme>
 </file>
 
-<file path=customXml/item1.xml><?xml version="1.0" encoding="utf-8"?>
+<file path=customXml/item1.xml>��< ? x m l   v e r s i o n = " 1 . 0 "   e n c o d i n g = " u t f - 1 6 " ? > < N a v W o r d R e p o r t X m l P a r t   x m l n s = " u r n : m i c r o s o f t - d y n a m i c s - n a v / r e p o r t s / I n v o i c e T e m p l a t e / 5 0 1 0 4 / " > + 
+     < S a l e s H e a d e r > + 
+         < B a n k A c c o u n t N a m e > B a n k A c c o u n t N a m e < / B a n k A c c o u n t N a m e > + 
+         < B a n k A c c o u n t N o > B a n k A c c o u n t N o < / B a n k A c c o u n t N o > + 
+         < B a n k B r a n c h > B a n k B r a n c h < / B a n k B r a n c h > + 
+         < B a n k I B A N > B a n k I B A N < / B a n k I B A N > + 
+         < B a n k S w i f t C o d e > B a n k S w i f t C o d e < / B a n k S w i f t C o d e > + 
+         < B i l l _ t o _ A d d r e s s > B i l l _ t o _ A d d r e s s < / B i l l _ t o _ A d d r e s s > + 
+         < C o m p a n y A d d r e s s > C o m p a n y A d d r e s s < / C o m p a n y A d d r e s s > + 
+         < C o m p a n y C i t y > C o m p a n y C i t y < / C o m p a n y C i t y > + 
+         < C o m p a n y C o u n t r y > C o m p a n y C o u n t r y < / C o m p a n y C o u n t r y > + 
+         < C o m p a n y E m a i l > C o m p a n y E m a i l < / C o m p a n y E m a i l > + 
+         < C o m p a n y N a m e > C o m p a n y N a m e < / C o m p a n y N a m e > + 
+         < C o m p a n y P h o n e > C o m p a n y P h o n e < / C o m p a n y P h o n e > + 
+         < C o m p a n y P i c t u r e > C o m p a n y P i c t u r e < / C o m p a n y P i c t u r e > + 
+         < C o m p a n y P o s t c o d e > C o m p a n y P o s t c o d e < / C o m p a n y P o s t c o d e > + 
+         < C o n t r a c t _ I D > C o n t r a c t _ I D < / C o n t r a c t _ I D > + 
+         < N o _ > N o _ < / N o _ > + 
+         < P o s t i n g _ D a t e > P o s t i n g _ D a t e < / P o s t i n g _ D a t e > + 
+         < S e l l _ t o _ C u s t o m e r _ N a m e > S e l l _ t o _ C u s t o m e r _ N a m e < / S e l l _ t o _ C u s t o m e r _ N a m e > + 
+         < S e l l _ t o _ E _ M a i l > S e l l _ t o _ E _ M a i l < / S e l l _ t o _ E _ M a i l > + 
+         < S e l l _ t o _ P h o n e _ N o _ > S e l l _ t o _ P h o n e _ N o _ < / S e l l _ t o _ P h o n e _ N o _ > + 
+         < V A T _ R e g i s t r a t i o n _ N o _ > V A T _ R e g i s t r a t i o n _ N o _ < / V A T _ R e g i s t r a t i o n _ N o _ > + 
+         < T e n a n c y _ C o n t r a c t > + 
+             < C o n t r a c t _ T e n o r > C o n t r a c t _ T e n o r < / C o n t r a c t _ T e n o r > + 
+             < P r o p e r t y _ N a m e > P r o p e r t y _ N a m e < / P r o p e r t y _ N a m e > + 
+             < U n i t _ N a m e > U n i t _ N a m e < / U n i t _ N a m e > + 
+         < / T e n a n c y _ C o n t r a c t > + 
+         < S a l e s _ L i n e > + 
+             < A m o u n t > A m o u n t < / A m o u n t > + 
+             < A m o u n t _ I n c l u d i n g _ V A T > A m o u n t _ I n c l u d i n g _ V A T < / A m o u n t _ I n c l u d i n g _ V A T > + 
+             < D e s c r i p t i o n > D e s c r i p t i o n < / D e s c r i p t i o n > + 
+             < L i n e _ A m o u n t > L i n e _ A m o u n t < / L i n e _ A m o u n t > + 
+             < S a l e L i n e N o _ > S a l e L i n e N o _ < / S a l e L i n e N o _ > + 
+             < V A T _ B a s e _ A m o u n t > V A T _ B a s e _ A m o u n t < / V A T _ B a s e _ A m o u n t > + 
+             < V A T _ _ > V A T _ _ < / V A T _ _ > + 
+         < / S a l e s _ L i n e > + 
+         < T o t a l s > + 
+             < T o t a l A m o u n t I n c l V A T > T o t a l A m o u n t I n c l V A T < / T o t a l A m o u n t I n c l V A T > + 
+             < T o t a l A m o u n t V A T > T o t a l A m o u n t V A T < / T o t a l A m o u n t V A T > + 
+             < T o t a l D u e > T o t a l D u e < / T o t a l D u e > + 
+             < T o t a l I n v D i s c A m o u n t > T o t a l I n v D i s c A m o u n t < / T o t a l I n v D i s c A m o u n t > + 
+             < T o t a l S u b T o t a l > T o t a l S u b T o t a l < / T o t a l S u b T o t a l > + 
+         < / T o t a l s > + 
+     < / S a l e s H e a d e r > + 
+ < / N a v W o r d R e p o r t X m l P a r t > 
+</file>
+
+<file path=customXml/item2.xml><?xml version="1.0" encoding="utf-8"?>
 <b:Sources xmlns:b="http://schemas.openxmlformats.org/officeDocument/2006/bibliography" xmlns="http://schemas.openxmlformats.org/officeDocument/2006/bibliography" SelectedStyle="\APASixthEditionOfficeOnline.xsl" StyleName="APA" Version="6"/>
 </file>
 
-<file path=customXml/item2.xml>��< ? x m l   v e r s i o n = " 1 . 0 "   e n c o d i n g = " u t f - 1 6 " ? > < N a v W o r d R e p o r t X m l P a r t   x m l n s = " u r n : m i c r o s o f t - d y n a m i c s - n a v / r e p o r t s / I n v o i c e T e m p l a t e / 5 0 1 0 4 / " > - 
-     < S a l e s H e a d e r > - 
-         < B a n k A c c o u n t N a m e > B a n k A c c o u n t N a m e < / B a n k A c c o u n t N a m e > - 
-         < B a n k A c c o u n t N o > B a n k A c c o u n t N o < / B a n k A c c o u n t N o > - 
-         < B a n k B r a n c h > B a n k B r a n c h < / B a n k B r a n c h > - 
-         < B a n k I B A N > B a n k I B A N < / B a n k I B A N > - 
-         < B a n k S w i f t C o d e > B a n k S w i f t C o d e < / B a n k S w i f t C o d e > - 
-         < B i l l _ t o _ A d d r e s s > B i l l _ t o _ A d d r e s s < / B i l l _ t o _ A d d r e s s > - 
-         < C o m p a n y A d d r e s s > C o m p a n y A d d r e s s < / C o m p a n y A d d r e s s > - 
-         < C o m p a n y C i t y > C o m p a n y C i t y < / C o m p a n y C i t y > - 
-         < C o m p a n y C o u n t r y > C o m p a n y C o u n t r y < / C o m p a n y C o u n t r y > - 
-         < C o m p a n y E m a i l > C o m p a n y E m a i l < / C o m p a n y E m a i l > - 
-         < C o m p a n y N a m e > C o m p a n y N a m e < / C o m p a n y N a m e > - 
-         < C o m p a n y P h o n e > C o m p a n y P h o n e < / C o m p a n y P h o n e > - 
-         < C o m p a n y P i c t u r e > C o m p a n y P i c t u r e < / C o m p a n y P i c t u r e > - 
-         < C o m p a n y P o s t c o d e > C o m p a n y P o s t c o d e < / C o m p a n y P o s t c o d e > - 
-         < C o n t r a c t _ I D > C o n t r a c t _ I D < / C o n t r a c t _ I D > - 
-         < N o _ > N o _ < / N o _ > - 
-         < P o s t i n g _ D a t e > P o s t i n g _ D a t e < / P o s t i n g _ D a t e > - 
-         < S e l l _ t o _ C u s t o m e r _ N a m e > S e l l _ t o _ C u s t o m e r _ N a m e < / S e l l _ t o _ C u s t o m e r _ N a m e > - 
-         < S e l l _ t o _ E _ M a i l > S e l l _ t o _ E _ M a i l < / S e l l _ t o _ E _ M a i l > - 
-         < S e l l _ t o _ P h o n e _ N o _ > S e l l _ t o _ P h o n e _ N o _ < / S e l l _ t o _ P h o n e _ N o _ > - 
-         < V A T _ R e g i s t r a t i o n _ N o _ > V A T _ R e g i s t r a t i o n _ N o _ < / V A T _ R e g i s t r a t i o n _ N o _ > - 
-         < T e n a n c y _ C o n t r a c t > - 
-             < C o n t r a c t _ T e n o r > C o n t r a c t _ T e n o r < / C o n t r a c t _ T e n o r > - 
-             < P r o p e r t y _ N a m e > P r o p e r t y _ N a m e < / P r o p e r t y _ N a m e > - 
-             < U n i t _ N a m e > U n i t _ N a m e < / U n i t _ N a m e > - 
-         < / T e n a n c y _ C o n t r a c t > - 
-         < S a l e s _ L i n e > - 
-             < A m o u n t > A m o u n t < / A m o u n t > - 
-             < A m o u n t _ I n c l u d i n g _ V A T > A m o u n t _ I n c l u d i n g _ V A T < / A m o u n t _ I n c l u d i n g _ V A T > - 
-             < D e s c r i p t i o n > D e s c r i p t i o n < / D e s c r i p t i o n > - 
-             < L i n e _ A m o u n t > L i n e _ A m o u n t < / L i n e _ A m o u n t > - 
-             < S a l e L i n e N o _ > S a l e L i n e N o _ < / S a l e L i n e N o _ > - 
-             < V A T _ B a s e _ A m o u n t > V A T _ B a s e _ A m o u n t < / V A T _ B a s e _ A m o u n t > - 
-             < V A T _ _ > V A T _ _ < / V A T _ _ > - 
-         < / S a l e s _ L i n e > - 
-         < T o t a l s > - 
-             < T o t a l A m o u n t I n c l V A T > T o t a l A m o u n t I n c l V A T < / T o t a l A m o u n t I n c l V A T > - 
-             < T o t a l A m o u n t V A T > T o t a l A m o u n t V A T < / T o t a l A m o u n t V A T > - 
-             < T o t a l D u e > T o t a l D u e < / T o t a l D u e > - 
-             < T o t a l I n v D i s c A m o u n t > T o t a l I n v D i s c A m o u n t < / T o t a l I n v D i s c A m o u n t > - 
-             < T o t a l S u b T o t a l > T o t a l S u b T o t a l < / T o t a l S u b T o t a l > - 
-         < / T o t a l s > - 
-     < / S a l e s H e a d e r > - 
- < / N a v W o r d R e p o r t X m l P a r t > 
+<file path=customXml/itemProps1.xml><?xml version="1.0" encoding="utf-8"?>
+<ds:datastoreItem xmlns:ds="http://schemas.openxmlformats.org/officeDocument/2006/customXml" ds:itemID="{4C18056B-02F0-444B-B2FC-0BE4239C06C0}">
+  <ds:schemaRefs>
+    <ds:schemaRef ds:uri="urn:microsoft-dynamics-nav/reports/InvoiceTemplate/50104/"/>
+  </ds:schemaRefs>
+</ds:datastoreItem>
 </file>
 
-<file path=customXml/itemProps1.xml><?xml version="1.0" encoding="utf-8"?>
+<file path=customXml/itemProps2.xml><?xml version="1.0" encoding="utf-8"?>
 <ds:datastoreItem xmlns:ds="http://schemas.openxmlformats.org/officeDocument/2006/customXml" ds:itemID="{23B65DDA-941C-4493-8ED3-FD13202D405C}">
   <ds:schemaRefs>
     <ds:schemaRef ds:uri="http://schemas.openxmlformats.org/officeDocument/2006/bibliography"/>
   </ds:schemaRefs>
 </ds:datastoreItem>
-</file>
-
-<file path=customXml/itemProps2.xml><?xml version="1.0" encoding="utf-8"?>
-<ds:datastoreItem xmlns:ds="http://schemas.openxmlformats.org/officeDocument/2006/customXml" ds:itemID="{4C18056B-02F0-444B-B2FC-0BE4239C06C0}">
-  <ds:schemaRefs>
-    <ds:schemaRef ds:uri="urn:microsoft-dynamics-nav/reports/InvoiceTemplate/50104/"/>
-  </ds:schemaRefs>
-</ds:datastoreItem>
 </file>
</xml_diff>

<commit_message>
RBA-435 & Add fields in Posted Sales Invoice
</commit_message>
<xml_diff>
--- a/InvoiceTemplate.docx
+++ b/InvoiceTemplate.docx
@@ -498,6 +498,26 @@
                   <w:r>
                     <w:t>Customer P.O:</w:t>
                   </w:r>
+                  <w:r>
+                    <w:t xml:space="preserve"> </w:t>
+                  </w:r>
+                  <w:sdt>
+                    <w:sdtPr>
+                      <w:id w:val="-164478636"/>
+                      <w:placeholder>
+                        <w:docPart w:val="DefaultPlaceholder_-1854013440"/>
+                      </w:placeholder>
+                      <w:dataBinding w:prefixMappings="xmlns:ns0='urn:microsoft-dynamics-nav/reports/InvoiceTemplate/50104/'" w:xpath="/ns0:NavWordReportXmlPart[1]/ns0:SalesHeader[1]/ns0:Customer_P_O[1]" w:storeItemID="{4C18056B-02F0-444B-B2FC-0BE4239C06C0}"/>
+                      <w:text/>
+                      <w:alias w:val="#Nav: /SalesHeader/Customer_P_O"/>
+                      <w:tag w:val="#Nav: InvoiceTemplate/50104"/>
+                    </w:sdtPr>
+                    <w:sdtContent>
+                      <w:r>
+                        <w:t>Customer_P_O</w:t>
+                      </w:r>
+                    </w:sdtContent>
+                  </w:sdt>
                 </w:p>
               </w:tc>
             </w:tr>
@@ -547,6 +567,26 @@
                   <w:r>
                     <w:t>Customer P.O Date:</w:t>
                   </w:r>
+                  <w:r>
+                    <w:t xml:space="preserve"> </w:t>
+                  </w:r>
+                  <w:sdt>
+                    <w:sdtPr>
+                      <w:id w:val="723876018"/>
+                      <w:placeholder>
+                        <w:docPart w:val="DefaultPlaceholder_-1854013440"/>
+                      </w:placeholder>
+                      <w:dataBinding w:prefixMappings="xmlns:ns0='urn:microsoft-dynamics-nav/reports/InvoiceTemplate/50104/'" w:xpath="/ns0:NavWordReportXmlPart[1]/ns0:SalesHeader[1]/ns0:Customer_P_O_Date[1]" w:storeItemID="{4C18056B-02F0-444B-B2FC-0BE4239C06C0}"/>
+                      <w:text/>
+                      <w:alias w:val="#Nav: /SalesHeader/Customer_P_O_Date"/>
+                      <w:tag w:val="#Nav: InvoiceTemplate/50104"/>
+                    </w:sdtPr>
+                    <w:sdtContent>
+                      <w:r>
+                        <w:t>Customer_P_O_Date</w:t>
+                      </w:r>
+                    </w:sdtContent>
+                  </w:sdt>
                 </w:p>
               </w:tc>
             </w:tr>
@@ -2846,6 +2886,7 @@
     <w:rsid w:val="002B3067"/>
     <w:rsid w:val="002C1010"/>
     <w:rsid w:val="002E6619"/>
+    <w:rsid w:val="002F40AC"/>
     <w:rsid w:val="00346F10"/>
     <w:rsid w:val="0035627A"/>
     <w:rsid w:val="00374077"/>
@@ -2870,6 +2911,7 @@
     <w:rsid w:val="007717D3"/>
     <w:rsid w:val="007A2AA1"/>
     <w:rsid w:val="007D0186"/>
+    <w:rsid w:val="007F5E67"/>
     <w:rsid w:val="008356FA"/>
     <w:rsid w:val="00844872"/>
     <w:rsid w:val="008542D7"/>
@@ -2883,6 +2925,7 @@
     <w:rsid w:val="009F48C4"/>
     <w:rsid w:val="00A11303"/>
     <w:rsid w:val="00A17C20"/>
+    <w:rsid w:val="00A22B01"/>
     <w:rsid w:val="00A469EA"/>
     <w:rsid w:val="00A7654E"/>
     <w:rsid w:val="00A85E8C"/>
@@ -3717,119 +3760,121 @@
 </a:theme>
 </file>
 
-<file path=customXml/item1.xml><?xml version="1.0" encoding="utf-8"?>
+<file path=customXml/item1.xml>��< ? x m l   v e r s i o n = " 1 . 0 "   e n c o d i n g = " u t f - 1 6 " ? > < N a v W o r d R e p o r t X m l P a r t   x m l n s = " u r n : m i c r o s o f t - d y n a m i c s - n a v / r e p o r t s / I n v o i c e T e m p l a t e / 5 0 1 0 4 / " > + 
+     < S a l e s H e a d e r > + 
+         < B a n k A c c o u n t N a m e > B a n k A c c o u n t N a m e < / B a n k A c c o u n t N a m e > + 
+         < B a n k A c c o u n t N o > B a n k A c c o u n t N o < / B a n k A c c o u n t N o > + 
+         < B a n k B r a n c h > B a n k B r a n c h < / B a n k B r a n c h > + 
+         < B a n k I B A N > B a n k I B A N < / B a n k I B A N > + 
+         < B a n k S w i f t C o d e > B a n k S w i f t C o d e < / B a n k S w i f t C o d e > + 
+         < B i l l _ t o _ A d d r e s s > B i l l _ t o _ A d d r e s s < / B i l l _ t o _ A d d r e s s > + 
+         < C o m p a n y A d d r e s s > C o m p a n y A d d r e s s < / C o m p a n y A d d r e s s > + 
+         < C o m p a n y C i t y > C o m p a n y C i t y < / C o m p a n y C i t y > + 
+         < C o m p a n y C o u n t r y > C o m p a n y C o u n t r y < / C o m p a n y C o u n t r y > + 
+         < C o m p a n y E m a i l > C o m p a n y E m a i l < / C o m p a n y E m a i l > + 
+         < C o m p a n y N a m e > C o m p a n y N a m e < / C o m p a n y N a m e > + 
+         < C o m p a n y P h o n e > C o m p a n y P h o n e < / C o m p a n y P h o n e > + 
+         < C o m p a n y P i c t u r e > C o m p a n y P i c t u r e < / C o m p a n y P i c t u r e > + 
+         < C o m p a n y P o s t c o d e > C o m p a n y P o s t c o d e < / C o m p a n y P o s t c o d e > + 
+         < C o n t r a c t _ I D > C o n t r a c t _ I D < / C o n t r a c t _ I D > + 
+         < C u s t o m e r _ P _ O > C u s t o m e r _ P _ O < / C u s t o m e r _ P _ O > + 
+         < C u s t o m e r _ P _ O _ D a t e > C u s t o m e r _ P _ O _ D a t e < / C u s t o m e r _ P _ O _ D a t e > + 
+         < D o c u m e n t _ D a t e > D o c u m e n t _ D a t e < / D o c u m e n t _ D a t e > + 
+         < N o _ > N o _ < / N o _ > + 
+         < P o s t i n g _ D a t e > P o s t i n g _ D a t e < / P o s t i n g _ D a t e > + 
+         < S e l l _ t o _ C u s t o m e r _ N a m e > S e l l _ t o _ C u s t o m e r _ N a m e < / S e l l _ t o _ C u s t o m e r _ N a m e > + 
+         < S e l l _ t o _ E _ M a i l > S e l l _ t o _ E _ M a i l < / S e l l _ t o _ E _ M a i l > + 
+         < S e l l _ t o _ P h o n e _ N o _ > S e l l _ t o _ P h o n e _ N o _ < / S e l l _ t o _ P h o n e _ N o _ > + 
+         < V A T _ R e g i s t r a t i o n _ N o _ > V A T _ R e g i s t r a t i o n _ N o _ < / V A T _ R e g i s t r a t i o n _ N o _ > + 
+         < T e n a n c y _ C o n t r a c t > + 
+             < C o n t r a c t _ T e n o r > C o n t r a c t _ T e n o r < / C o n t r a c t _ T e n o r > + 
+             < P r o p e r t y _ N a m e > P r o p e r t y _ N a m e < / P r o p e r t y _ N a m e > + 
+             < U n i t _ N a m e > U n i t _ N a m e < / U n i t _ N a m e > + 
+         < / T e n a n c y _ C o n t r a c t > + 
+         < S a l e s _ L i n e > + 
+             < A m o u n t > A m o u n t < / A m o u n t > + 
+             < A m o u n t _ I n c l u d i n g _ V A T > A m o u n t _ I n c l u d i n g _ V A T < / A m o u n t _ I n c l u d i n g _ V A T > + 
+             < D e s c r i p t i o n > D e s c r i p t i o n < / D e s c r i p t i o n > + 
+             < L i n e _ A m o u n t > L i n e _ A m o u n t < / L i n e _ A m o u n t > + 
+             < S a l e L i n e N o _ > S a l e L i n e N o _ < / S a l e L i n e N o _ > + 
+             < V A T _ B a s e _ A m o u n t > V A T _ B a s e _ A m o u n t < / V A T _ B a s e _ A m o u n t > + 
+             < V A T _ _ > V A T _ _ < / V A T _ _ > + 
+         < / S a l e s _ L i n e > + 
+         < T o t a l s > + 
+             < T o t a l A m o u n t I n c l V A T > T o t a l A m o u n t I n c l V A T < / T o t a l A m o u n t I n c l V A T > + 
+             < T o t a l A m o u n t V A T > T o t a l A m o u n t V A T < / T o t a l A m o u n t V A T > + 
+             < T o t a l D u e > T o t a l D u e < / T o t a l D u e > + 
+             < T o t a l I n v D i s c A m o u n t > T o t a l I n v D i s c A m o u n t < / T o t a l I n v D i s c A m o u n t > + 
+             < T o t a l S u b T o t a l > T o t a l S u b T o t a l < / T o t a l S u b T o t a l > + 
+         < / T o t a l s > + 
+     < / S a l e s H e a d e r > + 
+ < / N a v W o r d R e p o r t X m l P a r t > 
+</file>
+
+<file path=customXml/item2.xml><?xml version="1.0" encoding="utf-8"?>
 <b:Sources xmlns:b="http://schemas.openxmlformats.org/officeDocument/2006/bibliography" xmlns="http://schemas.openxmlformats.org/officeDocument/2006/bibliography" SelectedStyle="\APASixthEditionOfficeOnline.xsl" StyleName="APA" Version="6"/>
 </file>
 
-<file path=customXml/item2.xml>��< ? x m l   v e r s i o n = " 1 . 0 "   e n c o d i n g = " u t f - 1 6 " ? > - 
- < N a v W o r d R e p o r t X m l P a r t   x m l n s = " u r n : m i c r o s o f t - d y n a m i c s - n a v / r e p o r t s / I n v o i c e T e m p l a t e / 5 0 1 0 4 / " > - 
-     < S a l e s H e a d e r > - 
-         < B a n k A c c o u n t N a m e > B a n k A c c o u n t N a m e < / B a n k A c c o u n t N a m e > - 
-         < B a n k A c c o u n t N o > B a n k A c c o u n t N o < / B a n k A c c o u n t N o > - 
-         < B a n k B r a n c h > B a n k B r a n c h < / B a n k B r a n c h > - 
-         < B a n k I B A N > B a n k I B A N < / B a n k I B A N > - 
-         < B a n k S w i f t C o d e > B a n k S w i f t C o d e < / B a n k S w i f t C o d e > - 
-         < B i l l _ t o _ A d d r e s s > B i l l _ t o _ A d d r e s s < / B i l l _ t o _ A d d r e s s > - 
-         < C o m p a n y A d d r e s s > C o m p a n y A d d r e s s < / C o m p a n y A d d r e s s > - 
-         < C o m p a n y C i t y > C o m p a n y C i t y < / C o m p a n y C i t y > - 
-         < C o m p a n y C o u n t r y > C o m p a n y C o u n t r y < / C o m p a n y C o u n t r y > - 
-         < C o m p a n y E m a i l > C o m p a n y E m a i l < / C o m p a n y E m a i l > - 
-         < C o m p a n y N a m e > C o m p a n y N a m e < / C o m p a n y N a m e > - 
-         < C o m p a n y P h o n e > C o m p a n y P h o n e < / C o m p a n y P h o n e > - 
-         < C o m p a n y P i c t u r e > C o m p a n y P i c t u r e < / C o m p a n y P i c t u r e > - 
-         < C o m p a n y P o s t c o d e > C o m p a n y P o s t c o d e < / C o m p a n y P o s t c o d e > - 
-         < C o n t r a c t _ I D > C o n t r a c t _ I D < / C o n t r a c t _ I D > - 
-         < D o c u m e n t _ D a t e > D o c u m e n t _ D a t e < / D o c u m e n t _ D a t e > - 
-         < N o _ > N o _ < / N o _ > - 
-         < P o s t i n g _ D a t e > P o s t i n g _ D a t e < / P o s t i n g _ D a t e > - 
-         < S e l l _ t o _ C u s t o m e r _ N a m e > S e l l _ t o _ C u s t o m e r _ N a m e < / S e l l _ t o _ C u s t o m e r _ N a m e > - 
-         < S e l l _ t o _ E _ M a i l > S e l l _ t o _ E _ M a i l < / S e l l _ t o _ E _ M a i l > - 
-         < S e l l _ t o _ P h o n e _ N o _ > S e l l _ t o _ P h o n e _ N o _ < / S e l l _ t o _ P h o n e _ N o _ > - 
-         < V A T _ R e g i s t r a t i o n _ N o _ > V A T _ R e g i s t r a t i o n _ N o _ < / V A T _ R e g i s t r a t i o n _ N o _ > - 
-         < T e n a n c y _ C o n t r a c t > - 
-             < C o n t r a c t _ T e n o r > C o n t r a c t _ T e n o r < / C o n t r a c t _ T e n o r > - 
-             < P r o p e r t y _ N a m e > P r o p e r t y _ N a m e < / P r o p e r t y _ N a m e > - 
-             < U n i t _ N a m e > U n i t _ N a m e < / U n i t _ N a m e > - 
-         < / T e n a n c y _ C o n t r a c t > - 
-         < S a l e s _ L i n e > - 
-             < A m o u n t > A m o u n t < / A m o u n t > - 
-             < A m o u n t _ I n c l u d i n g _ V A T > A m o u n t _ I n c l u d i n g _ V A T < / A m o u n t _ I n c l u d i n g _ V A T > - 
-             < D e s c r i p t i o n > D e s c r i p t i o n < / D e s c r i p t i o n > - 
-             < L i n e _ A m o u n t > L i n e _ A m o u n t < / L i n e _ A m o u n t > - 
-             < S a l e L i n e N o _ > S a l e L i n e N o _ < / S a l e L i n e N o _ > - 
-             < V A T _ B a s e _ A m o u n t > V A T _ B a s e _ A m o u n t < / V A T _ B a s e _ A m o u n t > - 
-             < V A T _ _ > V A T _ _ < / V A T _ _ > - 
-         < / S a l e s _ L i n e > - 
-         < T o t a l s > - 
-             < T o t a l A m o u n t I n c l V A T > T o t a l A m o u n t I n c l V A T < / T o t a l A m o u n t I n c l V A T > - 
-             < T o t a l A m o u n t V A T > T o t a l A m o u n t V A T < / T o t a l A m o u n t V A T > - 
-             < T o t a l D u e > T o t a l D u e < / T o t a l D u e > - 
-             < T o t a l I n v D i s c A m o u n t > T o t a l I n v D i s c A m o u n t < / T o t a l I n v D i s c A m o u n t > - 
-             < T o t a l S u b T o t a l > T o t a l S u b T o t a l < / T o t a l S u b T o t a l > - 
-         < / T o t a l s > - 
-     < / S a l e s H e a d e r > - 
- < / N a v W o r d R e p o r t X m l P a r t > 
+<file path=customXml/itemProps1.xml><?xml version="1.0" encoding="utf-8"?>
+<ds:datastoreItem xmlns:ds="http://schemas.openxmlformats.org/officeDocument/2006/customXml" ds:itemID="{4C18056B-02F0-444B-B2FC-0BE4239C06C0}">
+  <ds:schemaRefs>
+    <ds:schemaRef ds:uri="urn:microsoft-dynamics-nav/reports/InvoiceTemplate/50104/"/>
+  </ds:schemaRefs>
+</ds:datastoreItem>
 </file>
 
-<file path=customXml/itemProps1.xml><?xml version="1.0" encoding="utf-8"?>
+<file path=customXml/itemProps2.xml><?xml version="1.0" encoding="utf-8"?>
 <ds:datastoreItem xmlns:ds="http://schemas.openxmlformats.org/officeDocument/2006/customXml" ds:itemID="{23B65DDA-941C-4493-8ED3-FD13202D405C}">
   <ds:schemaRefs>
     <ds:schemaRef ds:uri="http://schemas.openxmlformats.org/officeDocument/2006/bibliography"/>
   </ds:schemaRefs>
 </ds:datastoreItem>
-</file>
-
-<file path=customXml/itemProps2.xml><?xml version="1.0" encoding="utf-8"?>
-<ds:datastoreItem xmlns:ds="http://schemas.openxmlformats.org/officeDocument/2006/customXml" ds:itemID="{4C18056B-02F0-444B-B2FC-0BE4239C06C0}">
-  <ds:schemaRefs>
-    <ds:schemaRef ds:uri="urn:microsoft-dynamics-nav/reports/InvoiceTemplate/50104/"/>
-  </ds:schemaRefs>
-</ds:datastoreItem>
 </file>
</xml_diff>

<commit_message>
Changes in RBA-435 & 436
</commit_message>
<xml_diff>
--- a/InvoiceTemplate.docx
+++ b/InvoiceTemplate.docx
@@ -1,6 +1,6 @@
 
 <file path=word/document.xml><?xml version="1.0" encoding="utf-8"?>
-<w:document xmlns:a="http://schemas.openxmlformats.org/drawingml/2006/main" xmlns:pic="http://schemas.openxmlformats.org/drawingml/2006/picture" xmlns:wpc="http://schemas.microsoft.com/office/word/2010/wordprocessingCanvas" xmlns:cx="http://schemas.microsoft.com/office/drawing/2014/chartex" xmlns:cx1="http://schemas.microsoft.com/office/drawing/2015/9/8/chartex" xmlns:cx2="http://schemas.microsoft.com/office/drawing/2015/10/21/chartex" xmlns:cx3="http://schemas.microsoft.com/office/drawing/2016/5/9/chartex" xmlns:cx4="http://schemas.microsoft.com/office/drawing/2016/5/10/chartex" xmlns:cx5="http://schemas.microsoft.com/office/drawing/2016/5/11/chartex" xmlns:cx6="http://schemas.microsoft.com/office/drawing/2016/5/12/chartex" xmlns:cx7="http://schemas.microsoft.com/office/drawing/2016/5/13/chartex" xmlns:cx8="http://schemas.microsoft.com/office/drawing/2016/5/14/chartex" xmlns:mc="http://schemas.openxmlformats.org/markup-compatibility/2006" xmlns:aink="http://schemas.microsoft.com/office/drawing/2016/ink" xmlns:am3d="http://schemas.microsoft.com/office/drawing/2017/model3d" xmlns:o="urn:schemas-microsoft-com:office:office" xmlns:oel="http://schemas.microsoft.com/office/2019/extlst" xmlns:r="http://schemas.openxmlformats.org/officeDocument/2006/relationships" xmlns:m="http://schemas.openxmlformats.org/officeDocument/2006/math" xmlns:v="urn:schemas-microsoft-com:vml" xmlns:wp14="http://schemas.microsoft.com/office/word/2010/wordprocessingDrawing" xmlns:wp="http://schemas.openxmlformats.org/drawingml/2006/wordprocessingDrawing" xmlns:w10="urn:schemas-microsoft-com:office:word" xmlns:w="http://schemas.openxmlformats.org/wordprocessingml/2006/main" xmlns:w14="http://schemas.microsoft.com/office/word/2010/wordml" xmlns:w15="http://schemas.microsoft.com/office/word/2012/wordml" xmlns:w16cex="http://schemas.microsoft.com/office/word/2018/wordml/cex" xmlns:w16cid="http://schemas.microsoft.com/office/word/2016/wordml/cid" xmlns:w16="http://schemas.microsoft.com/office/word/2018/wordml" xmlns:w16du="http://schemas.microsoft.com/office/word/2023/wordml/word16du" xmlns:w16sdtdh="http://schemas.microsoft.com/office/word/2020/wordml/sdtdatahash" xmlns:w16se="http://schemas.microsoft.com/office/word/2015/wordml/symex" xmlns:wpg="http://schemas.microsoft.com/office/word/2010/wordprocessingGroup" xmlns:wpi="http://schemas.microsoft.com/office/word/2010/wordprocessingInk" xmlns:wne="http://schemas.microsoft.com/office/word/2006/wordml" xmlns:wps="http://schemas.microsoft.com/office/word/2010/wordprocessingShape" mc:Ignorable="w14 w15 w16se w16cid w16 w16cex w16sdtdh w16du wp14">
+<w:document xmlns:wpc="http://schemas.microsoft.com/office/word/2010/wordprocessingCanvas" xmlns:cx="http://schemas.microsoft.com/office/drawing/2014/chartex" xmlns:cx1="http://schemas.microsoft.com/office/drawing/2015/9/8/chartex" xmlns:cx2="http://schemas.microsoft.com/office/drawing/2015/10/21/chartex" xmlns:cx3="http://schemas.microsoft.com/office/drawing/2016/5/9/chartex" xmlns:cx4="http://schemas.microsoft.com/office/drawing/2016/5/10/chartex" xmlns:cx5="http://schemas.microsoft.com/office/drawing/2016/5/11/chartex" xmlns:cx6="http://schemas.microsoft.com/office/drawing/2016/5/12/chartex" xmlns:cx7="http://schemas.microsoft.com/office/drawing/2016/5/13/chartex" xmlns:cx8="http://schemas.microsoft.com/office/drawing/2016/5/14/chartex" xmlns:mc="http://schemas.openxmlformats.org/markup-compatibility/2006" xmlns:aink="http://schemas.microsoft.com/office/drawing/2016/ink" xmlns:am3d="http://schemas.microsoft.com/office/drawing/2017/model3d" xmlns:o="urn:schemas-microsoft-com:office:office" xmlns:oel="http://schemas.microsoft.com/office/2019/extlst" xmlns:r="http://schemas.openxmlformats.org/officeDocument/2006/relationships" xmlns:m="http://schemas.openxmlformats.org/officeDocument/2006/math" xmlns:v="urn:schemas-microsoft-com:vml" xmlns:wp14="http://schemas.microsoft.com/office/word/2010/wordprocessingDrawing" xmlns:wp="http://schemas.openxmlformats.org/drawingml/2006/wordprocessingDrawing" xmlns:w10="urn:schemas-microsoft-com:office:word" xmlns:w="http://schemas.openxmlformats.org/wordprocessingml/2006/main" xmlns:w14="http://schemas.microsoft.com/office/word/2010/wordml" xmlns:w15="http://schemas.microsoft.com/office/word/2012/wordml" xmlns:w16cex="http://schemas.microsoft.com/office/word/2018/wordml/cex" xmlns:w16cid="http://schemas.microsoft.com/office/word/2016/wordml/cid" xmlns:w16="http://schemas.microsoft.com/office/word/2018/wordml" xmlns:w16du="http://schemas.microsoft.com/office/word/2023/wordml/word16du" xmlns:w16sdtdh="http://schemas.microsoft.com/office/word/2020/wordml/sdtdatahash" xmlns:w16se="http://schemas.microsoft.com/office/word/2015/wordml/symex" xmlns:wpg="http://schemas.microsoft.com/office/word/2010/wordprocessingGroup" xmlns:wpi="http://schemas.microsoft.com/office/word/2010/wordprocessingInk" xmlns:wne="http://schemas.microsoft.com/office/word/2006/wordml" xmlns:wps="http://schemas.microsoft.com/office/word/2010/wordprocessingShape" mc:Ignorable="w14 w15 w16se w16cid w16 w16cex w16sdtdh w16du wp14">
   <w:body>
     <w:tbl>
       <w:tblPr>
@@ -20,10 +20,10 @@
           <w:tcPr>
             <w:tcW w:w="11341" w:type="dxa"/>
             <w:tcBorders>
-              <w:top w:val="single" w:color="auto" w:sz="12" w:space="0"/>
-              <w:left w:val="single" w:color="auto" w:sz="12" w:space="0"/>
-              <w:bottom w:val="single" w:color="auto" w:sz="12" w:space="0"/>
-              <w:right w:val="single" w:color="auto" w:sz="12" w:space="0"/>
+              <w:top w:val="single" w:sz="12" w:space="0" w:color="auto"/>
+              <w:left w:val="single" w:sz="12" w:space="0" w:color="auto"/>
+              <w:bottom w:val="single" w:sz="12" w:space="0" w:color="auto"/>
+              <w:right w:val="single" w:sz="12" w:space="0" w:color="auto"/>
             </w:tcBorders>
           </w:tcPr>
           <w:tbl>
@@ -75,6 +75,7 @@
                       <w:text/>
                     </w:sdtPr>
                     <w:sdtContent>
+                      <w:proofErr w:type="spellStart"/>
                       <w:r>
                         <w:rPr>
                           <w:b/>
@@ -84,6 +85,7 @@
                         </w:rPr>
                         <w:t>CompanyName</w:t>
                       </w:r>
+                      <w:proofErr w:type="spellEnd"/>
                     </w:sdtContent>
                   </w:sdt>
                 </w:p>
@@ -143,9 +145,11 @@
                       </w:tcBorders>
                     </w:tcPr>
                     <w:p>
+                      <w:proofErr w:type="spellStart"/>
                       <w:r>
                         <w:t>CompanyAddress</w:t>
                       </w:r>
+                      <w:proofErr w:type="spellEnd"/>
                     </w:p>
                   </w:tc>
                 </w:sdtContent>
@@ -168,7 +172,7 @@
                         <w:top w:val="nil"/>
                         <w:left w:val="nil"/>
                         <w:bottom w:val="nil"/>
-                        <w:right w:val="single" w:color="auto" w:sz="4" w:space="0"/>
+                        <w:right w:val="single" w:sz="4" w:space="0" w:color="auto"/>
                       </w:tcBorders>
                     </w:tcPr>
                     <w:p>
@@ -250,6 +254,7 @@
                       <w:text/>
                     </w:sdtPr>
                     <w:sdtContent>
+                      <w:proofErr w:type="spellStart"/>
                       <w:r>
                         <w:t>CompanyCity</w:t>
                       </w:r>
@@ -293,6 +298,7 @@
                       <w:r>
                         <w:t>CompanyCountry</w:t>
                       </w:r>
+                      <w:proofErr w:type="spellEnd"/>
                     </w:sdtContent>
                   </w:sdt>
                 </w:p>
@@ -306,7 +312,7 @@
                     <w:top w:val="nil"/>
                     <w:left w:val="nil"/>
                     <w:bottom w:val="nil"/>
-                    <w:right w:val="single" w:color="auto" w:sz="4" w:space="0"/>
+                    <w:right w:val="single" w:sz="4" w:space="0" w:color="auto"/>
                   </w:tcBorders>
                 </w:tcPr>
                 <w:p/>
@@ -339,9 +345,11 @@
                       <w:text/>
                     </w:sdtPr>
                     <w:sdtContent>
+                      <w:proofErr w:type="spellStart"/>
                       <w:r>
                         <w:t>CompanyPhone</w:t>
                       </w:r>
+                      <w:proofErr w:type="spellEnd"/>
                     </w:sdtContent>
                   </w:sdt>
                 </w:p>
@@ -355,7 +363,7 @@
                     <w:top w:val="nil"/>
                     <w:left w:val="nil"/>
                     <w:bottom w:val="nil"/>
-                    <w:right w:val="single" w:color="auto" w:sz="4" w:space="0"/>
+                    <w:right w:val="single" w:sz="4" w:space="0" w:color="auto"/>
                   </w:tcBorders>
                 </w:tcPr>
                 <w:p/>
@@ -388,9 +396,11 @@
                       <w:text/>
                     </w:sdtPr>
                     <w:sdtContent>
+                      <w:proofErr w:type="spellStart"/>
                       <w:r>
                         <w:t>CompanyEmail</w:t>
                       </w:r>
+                      <w:proofErr w:type="spellEnd"/>
                     </w:sdtContent>
                   </w:sdt>
                 </w:p>
@@ -404,7 +414,7 @@
                     <w:top w:val="nil"/>
                     <w:left w:val="nil"/>
                     <w:bottom w:val="nil"/>
-                    <w:right w:val="single" w:color="auto" w:sz="4" w:space="0"/>
+                    <w:right w:val="single" w:sz="4" w:space="0" w:color="auto"/>
                   </w:tcBorders>
                 </w:tcPr>
                 <w:p/>
@@ -436,7 +446,7 @@
                     <w:top w:val="nil"/>
                     <w:left w:val="nil"/>
                     <w:bottom w:val="nil"/>
-                    <w:right w:val="single" w:color="auto" w:sz="4" w:space="0"/>
+                    <w:right w:val="single" w:sz="4" w:space="0" w:color="auto"/>
                   </w:tcBorders>
                 </w:tcPr>
                 <w:p/>
@@ -503,19 +513,21 @@
                   </w:r>
                   <w:sdt>
                     <w:sdtPr>
+                      <w:alias w:val="#Nav: /SalesHeader/Customer_P_O"/>
+                      <w:tag w:val="#Nav: InvoiceTemplate/50104"/>
                       <w:id w:val="-164478636"/>
                       <w:placeholder>
                         <w:docPart w:val="DefaultPlaceholder_-1854013440"/>
                       </w:placeholder>
                       <w:dataBinding w:prefixMappings="xmlns:ns0='urn:microsoft-dynamics-nav/reports/InvoiceTemplate/50104/'" w:xpath="/ns0:NavWordReportXmlPart[1]/ns0:SalesHeader[1]/ns0:Customer_P_O[1]" w:storeItemID="{4C18056B-02F0-444B-B2FC-0BE4239C06C0}"/>
                       <w:text/>
-                      <w:alias w:val="#Nav: /SalesHeader/Customer_P_O"/>
-                      <w:tag w:val="#Nav: InvoiceTemplate/50104"/>
                     </w:sdtPr>
                     <w:sdtContent>
+                      <w:proofErr w:type="spellStart"/>
                       <w:r>
                         <w:t>Customer_P_O</w:t>
                       </w:r>
+                      <w:proofErr w:type="spellEnd"/>
                     </w:sdtContent>
                   </w:sdt>
                 </w:p>
@@ -528,7 +540,7 @@
                   <w:gridSpan w:val="3"/>
                   <w:tcBorders>
                     <w:top w:val="nil"/>
-                    <w:bottom w:val="single" w:color="auto" w:sz="4" w:space="0"/>
+                    <w:bottom w:val="single" w:sz="4" w:space="0" w:color="auto"/>
                   </w:tcBorders>
                 </w:tcPr>
                 <w:p>
@@ -547,9 +559,11 @@
                       <w:text/>
                     </w:sdtPr>
                     <w:sdtContent>
+                      <w:proofErr w:type="spellStart"/>
                       <w:r>
                         <w:t>Posting_Date</w:t>
                       </w:r>
+                      <w:proofErr w:type="spellEnd"/>
                     </w:sdtContent>
                   </w:sdt>
                 </w:p>
@@ -560,7 +574,7 @@
                   <w:gridSpan w:val="4"/>
                   <w:tcBorders>
                     <w:top w:val="nil"/>
-                    <w:bottom w:val="single" w:color="auto" w:sz="4" w:space="0"/>
+                    <w:bottom w:val="single" w:sz="4" w:space="0" w:color="auto"/>
                   </w:tcBorders>
                 </w:tcPr>
                 <w:p>
@@ -572,19 +586,21 @@
                   </w:r>
                   <w:sdt>
                     <w:sdtPr>
+                      <w:alias w:val="#Nav: /SalesHeader/Customer_P_O_Date"/>
+                      <w:tag w:val="#Nav: InvoiceTemplate/50104"/>
                       <w:id w:val="723876018"/>
                       <w:placeholder>
                         <w:docPart w:val="DefaultPlaceholder_-1854013440"/>
                       </w:placeholder>
                       <w:dataBinding w:prefixMappings="xmlns:ns0='urn:microsoft-dynamics-nav/reports/InvoiceTemplate/50104/'" w:xpath="/ns0:NavWordReportXmlPart[1]/ns0:SalesHeader[1]/ns0:Customer_P_O_Date[1]" w:storeItemID="{4C18056B-02F0-444B-B2FC-0BE4239C06C0}"/>
                       <w:text/>
-                      <w:alias w:val="#Nav: /SalesHeader/Customer_P_O_Date"/>
-                      <w:tag w:val="#Nav: InvoiceTemplate/50104"/>
                     </w:sdtPr>
                     <w:sdtContent>
+                      <w:proofErr w:type="spellStart"/>
                       <w:r>
                         <w:t>Customer_P_O_Date</w:t>
                       </w:r>
+                      <w:proofErr w:type="spellEnd"/>
                     </w:sdtContent>
                   </w:sdt>
                 </w:p>
@@ -656,6 +672,7 @@
                       </w:tcBorders>
                     </w:tcPr>
                     <w:p>
+                      <w:proofErr w:type="spellStart"/>
                       <w:r>
                         <w:rPr>
                           <w:b/>
@@ -663,6 +680,7 @@
                         </w:rPr>
                         <w:t>Sell_to_Customer_Name</w:t>
                       </w:r>
+                      <w:proofErr w:type="spellEnd"/>
                     </w:p>
                   </w:tc>
                 </w:sdtContent>
@@ -691,9 +709,11 @@
                       <w:text/>
                     </w:sdtPr>
                     <w:sdtContent>
+                      <w:proofErr w:type="spellStart"/>
                       <w:r>
                         <w:t>Contract_ID</w:t>
                       </w:r>
+                      <w:proofErr w:type="spellEnd"/>
                     </w:sdtContent>
                   </w:sdt>
                 </w:p>
@@ -725,9 +745,11 @@
                       </w:tcBorders>
                     </w:tcPr>
                     <w:p>
+                      <w:proofErr w:type="spellStart"/>
                       <w:r>
                         <w:t>Bill_to_Address</w:t>
                       </w:r>
+                      <w:proofErr w:type="spellEnd"/>
                     </w:p>
                   </w:tc>
                 </w:sdtContent>
@@ -757,9 +779,11 @@
                       <w:text/>
                     </w:sdtPr>
                     <w:sdtContent>
+                      <w:proofErr w:type="spellStart"/>
                       <w:r>
                         <w:t>Property_Name</w:t>
                       </w:r>
+                      <w:proofErr w:type="spellEnd"/>
                     </w:sdtContent>
                   </w:sdt>
                 </w:p>
@@ -794,8 +818,13 @@
                       <w:text/>
                     </w:sdtPr>
                     <w:sdtContent>
+                      <w:proofErr w:type="spellStart"/>
                       <w:r>
-                        <w:t>Sell_to_Phone_No_</w:t>
+                        <w:t>Sell_to_Phone_No</w:t>
+                      </w:r>
+                      <w:proofErr w:type="spellEnd"/>
+                      <w:r>
+                        <w:t>_</w:t>
                       </w:r>
                     </w:sdtContent>
                   </w:sdt>
@@ -826,9 +855,11 @@
                       <w:text/>
                     </w:sdtPr>
                     <w:sdtContent>
+                      <w:proofErr w:type="spellStart"/>
                       <w:r>
                         <w:t>Unit_Name</w:t>
                       </w:r>
+                      <w:proofErr w:type="spellEnd"/>
                     </w:sdtContent>
                   </w:sdt>
                 </w:p>
@@ -863,9 +894,11 @@
                       <w:text/>
                     </w:sdtPr>
                     <w:sdtContent>
+                      <w:proofErr w:type="spellStart"/>
                       <w:r>
                         <w:t>Sell_to_E_Mail</w:t>
                       </w:r>
+                      <w:proofErr w:type="spellEnd"/>
                     </w:sdtContent>
                   </w:sdt>
                 </w:p>
@@ -891,19 +924,19 @@
                   </w:r>
                   <w:sdt>
                     <w:sdtPr>
-                      <w:alias w:val="#Nav: /SalesHeader/Tenancy_Contract/Contract_Tenor"/>
-                      <w:tag w:val="#Nav: InvoiceTemplate/50104"/>
-                      <w:id w:val="-39901187"/>
+                      <w:id w:val="1601063237"/>
                       <w:placeholder>
-                        <w:docPart w:val="5E8302E62A9F4C14A2C04E4079E3F109"/>
+                        <w:docPart w:val="DefaultPlaceholder_-1854013440"/>
                       </w:placeholder>
-                      <w:dataBinding w:prefixMappings="xmlns:ns0='urn:microsoft-dynamics-nav/reports/InvoiceTemplate/50104/'" w:xpath="/ns0:NavWordReportXmlPart[1]/ns0:SalesHeader[1]/ns0:Tenancy_Contract[1]/ns0:Contract_Tenor[1]" w:storeItemID="{4C18056B-02F0-444B-B2FC-0BE4239C06C0}"/>
+                      <w:dataBinding w:prefixMappings="xmlns:ns0='urn:microsoft-dynamics-nav/reports/InvoiceTemplate/50104/' " w:xpath="/ns0:NavWordReportXmlPart[1]/ns0:SalesHeader[1]/ns0:Contract_Period[1]" w:storeItemID="{4C18056B-02F0-444B-B2FC-0BE4239C06C0}"/>
                       <w:text/>
                     </w:sdtPr>
                     <w:sdtContent>
+                      <w:proofErr w:type="spellStart"/>
                       <w:r>
-                        <w:t>Contract_Tenor</w:t>
+                        <w:t>Contract_Period</w:t>
                       </w:r>
+                      <w:proofErr w:type="spellEnd"/>
                     </w:sdtContent>
                   </w:sdt>
                 </w:p>
@@ -937,8 +970,13 @@
                       <w:text/>
                     </w:sdtPr>
                     <w:sdtContent>
+                      <w:proofErr w:type="spellStart"/>
                       <w:r>
-                        <w:t>VAT_Registration_No_</w:t>
+                        <w:t>VAT_Registration_No</w:t>
+                      </w:r>
+                      <w:proofErr w:type="spellEnd"/>
+                      <w:r>
+                        <w:t>_</w:t>
                       </w:r>
                     </w:sdtContent>
                   </w:sdt>
@@ -952,7 +990,28 @@
                     <w:top w:val="nil"/>
                   </w:tcBorders>
                 </w:tcPr>
-                <w:p/>
+                <w:p>
+                  <w:r>
+                    <w:t xml:space="preserve">Contract Tenure: </w:t>
+                  </w:r>
+                  <w:sdt>
+                    <w:sdtPr>
+                      <w:id w:val="-172646885"/>
+                      <w:placeholder>
+                        <w:docPart w:val="DefaultPlaceholder_-1854013440"/>
+                      </w:placeholder>
+                      <w:dataBinding w:prefixMappings="xmlns:ns0='urn:microsoft-dynamics-nav/reports/InvoiceTemplate/50104/' " w:xpath="/ns0:NavWordReportXmlPart[1]/ns0:SalesHeader[1]/ns0:Tenancy_Contract[1]/ns0:Contract_Tenor[1]" w:storeItemID="{4C18056B-02F0-444B-B2FC-0BE4239C06C0}"/>
+                      <w:text/>
+                    </w:sdtPr>
+                    <w:sdtContent>
+                      <w:proofErr w:type="spellStart"/>
+                      <w:r>
+                        <w:t>Contract_Tenor</w:t>
+                      </w:r>
+                      <w:proofErr w:type="spellEnd"/>
+                    </w:sdtContent>
+                  </w:sdt>
+                </w:p>
               </w:tc>
             </w:tr>
             <w:tr>
@@ -1104,7 +1163,7 @@
                 <w:alias w:val="#Nav: /SalesHeader/Sales_Line"/>
                 <w:tag w:val="#Nav: InvoiceTemplate/50104"/>
                 <w:id w:val="1820616093"/>
-                <w15:dataBinding w:prefixMappings="xmlns:ns0='urn:microsoft-dynamics-nav/reports/InvoiceTemplate/50104/'" w:xpath="/ns0:NavWordReportXmlPart[1]/ns0:SalesHeader[1]/ns0:Sales_Line" w:storeItemID="{4C18056B-02F0-444B-B2FC-0BE4239C06C0}"/>
+                <w15:dataBinding w:prefixMappings="xmlns:ns0='urn:microsoft-dynamics-nav/reports/InvoiceTemplate/50104/' " w:xpath="/ns0:NavWordReportXmlPart[1]/ns0:SalesHeader[1]/ns0:Sales_Line" w:storeItemID="{4C18056B-02F0-444B-B2FC-0BE4239C06C0}"/>
                 <w15:repeatingSection/>
               </w:sdtPr>
               <w:sdtContent>
@@ -1241,9 +1300,11 @@
                               <w:tcW w:w="1961" w:type="dxa"/>
                             </w:tcPr>
                             <w:p>
+                              <w:proofErr w:type="spellStart"/>
                               <w:r>
                                 <w:t>Amount_Including_VAT</w:t>
                               </w:r>
+                              <w:proofErr w:type="spellEnd"/>
                             </w:p>
                           </w:tc>
                         </w:sdtContent>
@@ -1343,9 +1404,11 @@
                       <w:pPr>
                         <w:jc w:val="right"/>
                       </w:pPr>
+                      <w:proofErr w:type="spellStart"/>
                       <w:r>
                         <w:t>TotalAmountInclVAT</w:t>
                       </w:r>
+                      <w:proofErr w:type="spellEnd"/>
                     </w:p>
                   </w:tc>
                 </w:sdtContent>
@@ -1360,7 +1423,7 @@
                   <w:tcW w:w="10795" w:type="dxa"/>
                   <w:gridSpan w:val="7"/>
                   <w:tcBorders>
-                    <w:bottom w:val="single" w:color="auto" w:sz="4" w:space="0"/>
+                    <w:bottom w:val="single" w:sz="4" w:space="0" w:color="auto"/>
                   </w:tcBorders>
                 </w:tcPr>
                 <w:p>
@@ -1508,6 +1571,7 @@
                       <w:text/>
                     </w:sdtPr>
                     <w:sdtContent>
+                      <w:proofErr w:type="spellStart"/>
                       <w:r>
                         <w:rPr>
                           <w:rFonts w:ascii="Arial" w:hAnsi="Arial" w:cs="Arial"/>
@@ -1516,6 +1580,7 @@
                         </w:rPr>
                         <w:t>CompanyName</w:t>
                       </w:r>
+                      <w:proofErr w:type="spellEnd"/>
                     </w:sdtContent>
                   </w:sdt>
                 </w:p>
@@ -1561,6 +1626,7 @@
                       <w:text/>
                     </w:sdtPr>
                     <w:sdtContent>
+                      <w:proofErr w:type="spellStart"/>
                       <w:r>
                         <w:rPr>
                           <w:rFonts w:ascii="Arial" w:hAnsi="Arial" w:cs="Arial"/>
@@ -1569,6 +1635,7 @@
                         </w:rPr>
                         <w:t>BankAccountName</w:t>
                       </w:r>
+                      <w:proofErr w:type="spellEnd"/>
                     </w:sdtContent>
                   </w:sdt>
                 </w:p>
@@ -1655,6 +1722,7 @@
                       <w:text/>
                     </w:sdtPr>
                     <w:sdtContent>
+                      <w:proofErr w:type="spellStart"/>
                       <w:r>
                         <w:rPr>
                           <w:rFonts w:ascii="Arial" w:hAnsi="Arial" w:cs="Arial"/>
@@ -1663,6 +1731,7 @@
                         </w:rPr>
                         <w:t>BankAccountNo</w:t>
                       </w:r>
+                      <w:proofErr w:type="spellEnd"/>
                     </w:sdtContent>
                   </w:sdt>
                 </w:p>
@@ -1743,6 +1812,7 @@
                       <w:text/>
                     </w:sdtPr>
                     <w:sdtContent>
+                      <w:proofErr w:type="spellStart"/>
                       <w:r>
                         <w:rPr>
                           <w:rFonts w:ascii="Arial" w:hAnsi="Arial" w:cs="Arial"/>
@@ -1751,6 +1821,7 @@
                         </w:rPr>
                         <w:t>BankIBAN</w:t>
                       </w:r>
+                      <w:proofErr w:type="spellEnd"/>
                     </w:sdtContent>
                   </w:sdt>
                 </w:p>
@@ -1831,6 +1902,7 @@
                       <w:text/>
                     </w:sdtPr>
                     <w:sdtContent>
+                      <w:proofErr w:type="spellStart"/>
                       <w:r>
                         <w:rPr>
                           <w:rFonts w:ascii="Arial" w:hAnsi="Arial" w:cs="Arial"/>
@@ -1839,6 +1911,7 @@
                         </w:rPr>
                         <w:t>BankSwiftCode</w:t>
                       </w:r>
+                      <w:proofErr w:type="spellEnd"/>
                     </w:sdtContent>
                   </w:sdt>
                 </w:p>
@@ -1917,6 +1990,7 @@
                       <w:text/>
                     </w:sdtPr>
                     <w:sdtContent>
+                      <w:proofErr w:type="spellStart"/>
                       <w:r>
                         <w:rPr>
                           <w:rFonts w:ascii="Arial" w:hAnsi="Arial" w:cs="Arial"/>
@@ -1925,6 +1999,7 @@
                         </w:rPr>
                         <w:t>BankBranch</w:t>
                       </w:r>
+                      <w:proofErr w:type="spellEnd"/>
                     </w:sdtContent>
                   </w:sdt>
                 </w:p>
@@ -2005,7 +2080,7 @@
     <w:sectPr>
       <w:pgSz w:w="11906" w:h="16838"/>
       <w:pgMar w:top="1701" w:right="1134" w:bottom="1701" w:left="1134" w:header="708" w:footer="708" w:gutter="0"/>
-      <w:cols w:space="708" w:num="2"/>
+      <w:cols w:num="2" w:space="708"/>
       <w:docGrid w:linePitch="360"/>
     </w:sectPr>
   </w:body>
@@ -2782,35 +2857,6 @@
         </w:p>
       </w:docPartBody>
     </w:docPart>
-    <w:docPart>
-      <w:docPartPr>
-        <w:name w:val="5E8302E62A9F4C14A2C04E4079E3F109"/>
-        <w:category>
-          <w:name w:val="General"/>
-          <w:gallery w:val="placeholder"/>
-        </w:category>
-        <w:types>
-          <w:type w:val="bbPlcHdr"/>
-        </w:types>
-        <w:behaviors>
-          <w:behavior w:val="content"/>
-        </w:behaviors>
-        <w:guid w:val="{C72D3B4C-DC68-452C-B05B-36793B63CCB4}"/>
-      </w:docPartPr>
-      <w:docPartBody>
-        <w:p>
-          <w:pPr>
-            <w:pStyle w:val="5E8302E62A9F4C14A2C04E4079E3F109"/>
-          </w:pPr>
-          <w:r>
-            <w:rPr>
-              <w:rStyle w:val="PlaceholderText"/>
-            </w:rPr>
-            <w:t>Click or tap here to enter text.</w:t>
-          </w:r>
-        </w:p>
-      </w:docPartBody>
-    </w:docPart>
   </w:docParts>
 </w:glossaryDocument>
 </file>
@@ -2910,6 +2956,7 @@
     <w:rsid w:val="00743529"/>
     <w:rsid w:val="007717D3"/>
     <w:rsid w:val="007A2AA1"/>
+    <w:rsid w:val="007B62B9"/>
     <w:rsid w:val="007D0186"/>
     <w:rsid w:val="007F5E67"/>
     <w:rsid w:val="008356FA"/>
@@ -2939,6 +2986,7 @@
     <w:rsid w:val="00C77C36"/>
     <w:rsid w:val="00C84CBB"/>
     <w:rsid w:val="00CB5B2A"/>
+    <w:rsid w:val="00CB7E24"/>
     <w:rsid w:val="00CD3D83"/>
     <w:rsid w:val="00D06188"/>
     <w:rsid w:val="00D637D2"/>
@@ -3760,7 +3808,11 @@
 </a:theme>
 </file>
 
-<file path=customXml/item1.xml>��< ? x m l   v e r s i o n = " 1 . 0 "   e n c o d i n g = " u t f - 1 6 " ? > < N a v W o r d R e p o r t X m l P a r t   x m l n s = " u r n : m i c r o s o f t - d y n a m i c s - n a v / r e p o r t s / I n v o i c e T e m p l a t e / 5 0 1 0 4 / " > +<file path=customXml/item1.xml><?xml version="1.0" encoding="utf-8"?>
+<b:Sources xmlns:b="http://schemas.openxmlformats.org/officeDocument/2006/bibliography" xmlns="http://schemas.openxmlformats.org/officeDocument/2006/bibliography" SelectedStyle="\APASixthEditionOfficeOnline.xsl" StyleName="APA" Version="6"/>
+</file>
+
+<file path=customXml/item2.xml>��< ? x m l   v e r s i o n = " 1 . 0 "   e n c o d i n g = " u t f - 1 6 " ? > < N a v W o r d R e p o r t X m l P a r t   x m l n s = " u r n : m i c r o s o f t - d y n a m i c s - n a v / r e p o r t s / I n v o i c e T e m p l a t e / 5 0 1 0 4 / " >   
      < S a l e s H e a d e r >   
@@ -3793,6 +3845,8 @@
          < C o m p a n y P o s t c o d e > C o m p a n y P o s t c o d e < / C o m p a n y P o s t c o d e >   
          < C o n t r a c t _ I D > C o n t r a c t _ I D < / C o n t r a c t _ I D > + 
+         < C o n t r a c t _ P e r i o d > C o n t r a c t _ P e r i o d < / C o n t r a c t _ P e r i o d >   
          < C u s t o m e r _ P _ O > C u s t o m e r _ P _ O < / C u s t o m e r _ P _ O >   
@@ -3859,22 +3913,18 @@
  < / N a v W o r d R e p o r t X m l P a r t > 
 </file>
 
-<file path=customXml/item2.xml><?xml version="1.0" encoding="utf-8"?>
-<b:Sources xmlns:b="http://schemas.openxmlformats.org/officeDocument/2006/bibliography" xmlns="http://schemas.openxmlformats.org/officeDocument/2006/bibliography" SelectedStyle="\APASixthEditionOfficeOnline.xsl" StyleName="APA" Version="6"/>
+<file path=customXml/itemProps1.xml><?xml version="1.0" encoding="utf-8"?>
+<ds:datastoreItem xmlns:ds="http://schemas.openxmlformats.org/officeDocument/2006/customXml" ds:itemID="{23B65DDA-941C-4493-8ED3-FD13202D405C}">
+  <ds:schemaRefs>
+    <ds:schemaRef ds:uri="http://schemas.openxmlformats.org/officeDocument/2006/bibliography"/>
+  </ds:schemaRefs>
+</ds:datastoreItem>
 </file>
 
-<file path=customXml/itemProps1.xml><?xml version="1.0" encoding="utf-8"?>
+<file path=customXml/itemProps2.xml><?xml version="1.0" encoding="utf-8"?>
 <ds:datastoreItem xmlns:ds="http://schemas.openxmlformats.org/officeDocument/2006/customXml" ds:itemID="{4C18056B-02F0-444B-B2FC-0BE4239C06C0}">
   <ds:schemaRefs>
     <ds:schemaRef ds:uri="urn:microsoft-dynamics-nav/reports/InvoiceTemplate/50104/"/>
   </ds:schemaRefs>
 </ds:datastoreItem>
-</file>
-
-<file path=customXml/itemProps2.xml><?xml version="1.0" encoding="utf-8"?>
-<ds:datastoreItem xmlns:ds="http://schemas.openxmlformats.org/officeDocument/2006/customXml" ds:itemID="{23B65DDA-941C-4493-8ED3-FD13202D405C}">
-  <ds:schemaRefs>
-    <ds:schemaRef ds:uri="http://schemas.openxmlformats.org/officeDocument/2006/bibliography"/>
-  </ds:schemaRefs>
-</ds:datastoreItem>
 </file>
</xml_diff>